<commit_message>
Merge test data into single test-data.json with type-based filtering
- Combine search-terms.json and year-filter.json into test-data.json
- Add 'type' field (search/yearFilter) to each entry
- Update TestData.java DataProviders to filter by type from single file
- Update README and Word doc project structure references
</commit_message>
<xml_diff>
--- a/RB_Auction_Automation_Instructions.docx
+++ b/RB_Auction_Automation_Instructions.docx
@@ -1275,7 +1275,7 @@
         <w:t xml:space="preserve">Data Source: </w:t>
       </w:r>
       <w:r>
-        <w:t>src/test/resources/testdata/search-terms.json</w:t>
+        <w:t xml:space="preserve">            └── test-data.json          All test data (search + year filter)</w:t>
       </w:r>
     </w:p>
     <w:p>
@@ -1375,7 +1375,7 @@
         <w:t xml:space="preserve">Data Source: </w:t>
       </w:r>
       <w:r>
-        <w:t>src/test/resources/testdata/search-terms.json</w:t>
+        <w:t xml:space="preserve">            └── test-data.json          All test data (search + year filter)</w:t>
       </w:r>
     </w:p>
     <w:p>
@@ -1475,7 +1475,7 @@
         <w:t xml:space="preserve">Data Source: </w:t>
       </w:r>
       <w:r>
-        <w:t>src/test/resources/testdata/year-filter.json</w:t>
+        <w:t xml:space="preserve">            └── test-data.json          All test data (search + year filter)</w:t>
       </w:r>
     </w:p>
     <w:p>
@@ -2057,7 +2057,7 @@
           <w:b w:val="0"/>
           <w:i w:val="0"/>
         </w:rPr>
-        <w:t>External Test Data: Test data is stored in JSON files (search-terms.json, year-filter.json) and loaded via TestNG @DataProvider. Each test data entry includes a testPlanId, testCaseId, and human-readable name that appear in the test report (e.g., "TP-001 | TC-001 | Search Ford F-150 and verify first result").</w:t>
+        <w:t>External Test Data: Test data is stored in a single JSON file (test-data.json) and loaded via TestNG @DataProvider. Each test data entry includes a testPlanId, testCaseId, and human-readable name that appear in the test report (e.g., "TP-001 | TC-001 | Search Ford F-150 and verify first result").</w:t>
       </w:r>
     </w:p>
     <w:p>
@@ -2909,9 +2909,7 @@
         <w:br/>
         <w:t xml:space="preserve">        └── testdata/</w:t>
         <w:br/>
-        <w:t xml:space="preserve">            ├── search-terms.json         Ford F-150 + Chevrolet Colodrado</w:t>
-        <w:br/>
-        <w:t xml:space="preserve">            └── year-filter.json          F-150, fromYear: 2010</w:t>
+        <w:t xml:space="preserve">            └── test-data.json          All test data (search + year filter)</w:t>
       </w:r>
     </w:p>
     <w:p>

</xml_diff>